<commit_message>
Definiendo variables, entrada de datos y decision
</commit_message>
<xml_diff>
--- a/INDICACIONES CLASE/INDICACIONES.docx
+++ b/INDICACIONES CLASE/INDICACIONES.docx
@@ -6,239 +6,222 @@
       <w:pPr>
         <w:rPr>
           <w:color w:val="84E290" w:themeColor="accent3" w:themeTint="66"/>
-          <w:lang w:val="en-US"/>
         </w:rPr>
       </w:pPr>
       <w:r>
         <w:rPr>
           <w:color w:val="84E290" w:themeColor="accent3" w:themeTint="66"/>
-          <w:lang w:val="en-US"/>
-        </w:rPr>
-        <w:t>Git bash, Visual Studio c</w:t>
-      </w:r>
-      <w:r>
+        </w:rPr>
+        <w:t>Git bash, Visual Studio code</w:t>
+      </w:r>
+    </w:p>
+    <w:p>
+      <w:pPr>
         <w:rPr>
           <w:color w:val="84E290" w:themeColor="accent3" w:themeTint="66"/>
-          <w:lang w:val="en-US"/>
-        </w:rPr>
-        <w:t>ode</w:t>
-      </w:r>
-    </w:p>
-    <w:p>
-      <w:pPr>
+          <w:lang w:val="es-MX"/>
+        </w:rPr>
+      </w:pPr>
+      <w:r>
         <w:rPr>
           <w:color w:val="84E290" w:themeColor="accent3" w:themeTint="66"/>
           <w:lang w:val="es-MX"/>
         </w:rPr>
-      </w:pPr>
+        <w:t>Verde</w:t>
+      </w:r>
       <w:r>
         <w:rPr>
           <w:color w:val="84E290" w:themeColor="accent3" w:themeTint="66"/>
           <w:lang w:val="es-MX"/>
         </w:rPr>
-        <w:t>Verde</w:t>
-      </w:r>
-      <w:r>
+        <w:t>---Dato a cambiar</w:t>
+      </w:r>
+    </w:p>
+    <w:p>
+      <w:pPr>
         <w:rPr>
           <w:color w:val="84E290" w:themeColor="accent3" w:themeTint="66"/>
           <w:lang w:val="es-MX"/>
         </w:rPr>
-        <w:t>---Dato a cambiar</w:t>
-      </w:r>
-    </w:p>
-    <w:p>
-      <w:pPr>
+      </w:pPr>
+      <w:r>
         <w:rPr>
           <w:color w:val="84E290" w:themeColor="accent3" w:themeTint="66"/>
           <w:lang w:val="es-MX"/>
         </w:rPr>
-      </w:pPr>
-      <w:r>
+        <w:t>Azul---Que es lo que hace el comando</w:t>
+      </w:r>
+    </w:p>
+    <w:p>
+      <w:pPr>
         <w:rPr>
           <w:color w:val="84E290" w:themeColor="accent3" w:themeTint="66"/>
           <w:lang w:val="es-MX"/>
         </w:rPr>
-        <w:t>Azul---Que es lo que hace el comando</w:t>
-      </w:r>
-    </w:p>
-    <w:p>
-      <w:pPr>
+      </w:pPr>
+      <w:r>
         <w:rPr>
           <w:color w:val="84E290" w:themeColor="accent3" w:themeTint="66"/>
           <w:lang w:val="es-MX"/>
         </w:rPr>
-      </w:pPr>
-      <w:r>
+        <w:t>Negro--Comando</w:t>
+      </w:r>
+    </w:p>
+    <w:p>
+      <w:pPr>
+        <w:rPr>
+          <w:lang w:val="es-MX"/>
+        </w:rPr>
+      </w:pPr>
+      <w:r>
+        <w:rPr>
+          <w:lang w:val="es-MX"/>
+        </w:rPr>
+        <w:t>Pwd</w:t>
+      </w:r>
+    </w:p>
+    <w:p>
+      <w:pPr>
+        <w:rPr>
+          <w:color w:val="0070C0"/>
+          <w:lang w:val="es-MX"/>
+        </w:rPr>
+      </w:pPr>
+      <w:r>
+        <w:rPr>
+          <w:color w:val="0070C0"/>
+          <w:lang w:val="es-MX"/>
+        </w:rPr>
+        <w:t>Ver donde estoy</w:t>
+      </w:r>
+    </w:p>
+    <w:p>
+      <w:pPr>
+        <w:rPr>
+          <w:lang w:val="es-MX"/>
+        </w:rPr>
+      </w:pPr>
+      <w:r>
+        <w:rPr>
+          <w:lang w:val="es-MX"/>
+        </w:rPr>
+        <w:t>cd d:</w:t>
+      </w:r>
+    </w:p>
+    <w:p>
+      <w:pPr>
+        <w:rPr>
+          <w:color w:val="0070C0"/>
+          <w:lang w:val="es-MX"/>
+        </w:rPr>
+      </w:pPr>
+      <w:r>
+        <w:rPr>
+          <w:color w:val="0070C0"/>
+          <w:lang w:val="es-MX"/>
+        </w:rPr>
+        <w:t>Para ir al disco d</w:t>
+      </w:r>
+    </w:p>
+    <w:p>
+      <w:pPr>
+        <w:rPr>
+          <w:lang w:val="es-MX"/>
+        </w:rPr>
+      </w:pPr>
+      <w:r>
+        <w:rPr>
+          <w:lang w:val="es-MX"/>
+        </w:rPr>
+        <w:t>Ls</w:t>
+      </w:r>
+    </w:p>
+    <w:p>
+      <w:pPr>
+        <w:rPr>
+          <w:color w:val="0070C0"/>
+          <w:lang w:val="es-MX"/>
+        </w:rPr>
+      </w:pPr>
+      <w:r>
+        <w:rPr>
+          <w:color w:val="0070C0"/>
+          <w:lang w:val="es-MX"/>
+        </w:rPr>
+        <w:t>Ver que archivos tiene</w:t>
+      </w:r>
+    </w:p>
+    <w:p>
+      <w:pPr>
         <w:rPr>
           <w:color w:val="84E290" w:themeColor="accent3" w:themeTint="66"/>
           <w:lang w:val="es-MX"/>
         </w:rPr>
-        <w:t>Negro--Comando</w:t>
-      </w:r>
-    </w:p>
-    <w:p>
-      <w:pPr>
-        <w:rPr>
-          <w:lang w:val="es-MX"/>
-        </w:rPr>
-      </w:pPr>
-      <w:r>
-        <w:rPr>
-          <w:lang w:val="es-MX"/>
-        </w:rPr>
-        <w:t>Pwd</w:t>
-      </w:r>
-    </w:p>
-    <w:p>
-      <w:pPr>
-        <w:rPr>
-          <w:color w:val="0070C0"/>
-          <w:lang w:val="es-MX"/>
-        </w:rPr>
-      </w:pPr>
-      <w:r>
-        <w:rPr>
-          <w:color w:val="0070C0"/>
-          <w:lang w:val="es-MX"/>
-        </w:rPr>
-        <w:t>Ver donde estoy</w:t>
-      </w:r>
-    </w:p>
-    <w:p>
-      <w:pPr>
-        <w:rPr>
-          <w:lang w:val="es-MX"/>
-        </w:rPr>
-      </w:pPr>
-      <w:r>
-        <w:rPr>
-          <w:lang w:val="es-MX"/>
-        </w:rPr>
-        <w:t>cd d:</w:t>
-      </w:r>
-    </w:p>
-    <w:p>
-      <w:pPr>
-        <w:rPr>
-          <w:color w:val="0070C0"/>
-          <w:lang w:val="es-MX"/>
-        </w:rPr>
-      </w:pPr>
-      <w:r>
-        <w:rPr>
-          <w:color w:val="0070C0"/>
-          <w:lang w:val="es-MX"/>
-        </w:rPr>
-        <w:t>Para ir al disco d</w:t>
-      </w:r>
-    </w:p>
-    <w:p>
-      <w:pPr>
-        <w:rPr>
-          <w:lang w:val="es-MX"/>
-        </w:rPr>
-      </w:pPr>
-      <w:r>
-        <w:rPr>
-          <w:lang w:val="es-MX"/>
-        </w:rPr>
-        <w:t>Ls</w:t>
-      </w:r>
-    </w:p>
-    <w:p>
-      <w:pPr>
-        <w:rPr>
-          <w:color w:val="0070C0"/>
-          <w:lang w:val="es-MX"/>
-        </w:rPr>
-      </w:pPr>
-      <w:r>
-        <w:rPr>
-          <w:color w:val="0070C0"/>
-          <w:lang w:val="es-MX"/>
-        </w:rPr>
-        <w:t>Ver que archivos tiene</w:t>
-      </w:r>
-    </w:p>
-    <w:p>
-      <w:pPr>
+      </w:pPr>
+      <w:r>
+        <w:rPr>
+          <w:lang w:val="es-MX"/>
+        </w:rPr>
+        <w:t xml:space="preserve">cd </w:t>
+      </w:r>
+      <w:r>
         <w:rPr>
           <w:color w:val="84E290" w:themeColor="accent3" w:themeTint="66"/>
           <w:lang w:val="es-MX"/>
         </w:rPr>
-      </w:pPr>
-      <w:r>
-        <w:rPr>
-          <w:lang w:val="es-MX"/>
-        </w:rPr>
-        <w:t xml:space="preserve">cd </w:t>
+        <w:t>Algoritmos-I</w:t>
+      </w:r>
+    </w:p>
+    <w:p>
+      <w:pPr>
+        <w:rPr>
+          <w:color w:val="0070C0"/>
+          <w:lang w:val="es-MX"/>
+        </w:rPr>
+      </w:pPr>
+      <w:r>
+        <w:rPr>
+          <w:color w:val="0070C0"/>
+          <w:lang w:val="es-MX"/>
+        </w:rPr>
+        <w:t>Para ir a la carpeta</w:t>
+      </w:r>
+    </w:p>
+    <w:p>
+      <w:pPr>
+        <w:rPr>
+          <w:lang w:val="es-MX"/>
+        </w:rPr>
+      </w:pPr>
+      <w:r>
+        <w:rPr>
+          <w:lang w:val="es-MX"/>
+        </w:rPr>
+        <w:t>git add .</w:t>
+      </w:r>
+    </w:p>
+    <w:p>
+      <w:pPr>
+        <w:rPr>
+          <w:color w:val="0070C0"/>
+          <w:lang w:val="es-MX"/>
+        </w:rPr>
+      </w:pPr>
+      <w:r>
+        <w:rPr>
+          <w:color w:val="0070C0"/>
+          <w:lang w:val="es-MX"/>
+        </w:rPr>
+        <w:t>Para agregar a la carpeta</w:t>
+      </w:r>
+    </w:p>
+    <w:p>
+      <w:r>
+        <w:t>git commit -m “</w:t>
       </w:r>
       <w:r>
         <w:rPr>
           <w:color w:val="84E290" w:themeColor="accent3" w:themeTint="66"/>
-          <w:lang w:val="es-MX"/>
-        </w:rPr>
-        <w:t>Algoritmos-I</w:t>
-      </w:r>
-    </w:p>
-    <w:p>
-      <w:pPr>
-        <w:rPr>
-          <w:color w:val="0070C0"/>
-          <w:lang w:val="es-MX"/>
-        </w:rPr>
-      </w:pPr>
-      <w:r>
-        <w:rPr>
-          <w:color w:val="0070C0"/>
-          <w:lang w:val="es-MX"/>
-        </w:rPr>
-        <w:t>Para ir a la carpeta</w:t>
-      </w:r>
-    </w:p>
-    <w:p>
-      <w:pPr>
-        <w:rPr>
-          <w:lang w:val="es-MX"/>
-        </w:rPr>
-      </w:pPr>
-      <w:r>
-        <w:rPr>
-          <w:lang w:val="es-MX"/>
-        </w:rPr>
-        <w:t xml:space="preserve">git </w:t>
-      </w:r>
-      <w:proofErr w:type="gramStart"/>
-      <w:r>
-        <w:rPr>
-          <w:lang w:val="es-MX"/>
-        </w:rPr>
-        <w:t>add .</w:t>
-      </w:r>
-      <w:proofErr w:type="gramEnd"/>
-    </w:p>
-    <w:p>
-      <w:pPr>
-        <w:rPr>
-          <w:color w:val="0070C0"/>
-          <w:lang w:val="es-MX"/>
-        </w:rPr>
-      </w:pPr>
-      <w:r>
-        <w:rPr>
-          <w:color w:val="0070C0"/>
-          <w:lang w:val="es-MX"/>
-        </w:rPr>
-        <w:t>Para agregar a la carpeta</w:t>
-      </w:r>
-    </w:p>
-    <w:p>
-      <w:r>
-        <w:t>git commit -m “</w:t>
-      </w:r>
-      <w:r>
-        <w:rPr>
-          <w:color w:val="84E290" w:themeColor="accent3" w:themeTint="66"/>
         </w:rPr>
         <w:t>Agregando ejercicio conversión</w:t>
       </w:r>
@@ -283,10 +266,393 @@
           <w:color w:val="0070C0"/>
         </w:rPr>
       </w:pPr>
+    </w:p>
+    <w:p>
+      <w:pPr>
+        <w:rPr>
+          <w:color w:val="0070C0"/>
+        </w:rPr>
+      </w:pPr>
+    </w:p>
+    <w:p>
+      <w:pPr>
+        <w:rPr>
+          <w:color w:val="0070C0"/>
+        </w:rPr>
+      </w:pPr>
+    </w:p>
+    <w:p>
+      <w:pPr>
+        <w:rPr>
+          <w:color w:val="0070C0"/>
+        </w:rPr>
+      </w:pPr>
+    </w:p>
+    <w:p>
+      <w:pPr>
+        <w:rPr>
+          <w:color w:val="0070C0"/>
+        </w:rPr>
+      </w:pPr>
+    </w:p>
+    <w:p>
+      <w:pPr>
+        <w:rPr>
+          <w:color w:val="0070C0"/>
+        </w:rPr>
+      </w:pPr>
+    </w:p>
+    <w:p>
+      <w:pPr>
+        <w:rPr>
+          <w:color w:val="0070C0"/>
+        </w:rPr>
+      </w:pPr>
+    </w:p>
+    <w:p>
+      <w:pPr>
+        <w:rPr>
+          <w:color w:val="0070C0"/>
+        </w:rPr>
+      </w:pPr>
+    </w:p>
+    <w:p>
+      <w:pPr>
+        <w:rPr>
+          <w:color w:val="0070C0"/>
+        </w:rPr>
+      </w:pPr>
+    </w:p>
+    <w:p>
+      <w:pPr>
+        <w:rPr>
+          <w:color w:val="0070C0"/>
+        </w:rPr>
+      </w:pPr>
+      <w:r>
+        <w:rPr>
+          <w:noProof/>
+          <w:color w:val="0070C0"/>
+        </w:rPr>
+        <w:lastRenderedPageBreak/>
+        <w:drawing>
+          <wp:inline distT="0" distB="0" distL="0" distR="0" wp14:anchorId="266EC581" wp14:editId="029B9B37">
+            <wp:extent cx="3886742" cy="857370"/>
+            <wp:effectExtent l="0" t="0" r="0" b="0"/>
+            <wp:docPr id="1" name="Imagen 1"/>
+            <wp:cNvGraphicFramePr>
+              <a:graphicFrameLocks xmlns:a="http://schemas.openxmlformats.org/drawingml/2006/main" noChangeAspect="1"/>
+            </wp:cNvGraphicFramePr>
+            <a:graphic xmlns:a="http://schemas.openxmlformats.org/drawingml/2006/main">
+              <a:graphicData uri="http://schemas.openxmlformats.org/drawingml/2006/picture">
+                <pic:pic xmlns:pic="http://schemas.openxmlformats.org/drawingml/2006/picture">
+                  <pic:nvPicPr>
+                    <pic:cNvPr id="1" name=""/>
+                    <pic:cNvPicPr/>
+                  </pic:nvPicPr>
+                  <pic:blipFill>
+                    <a:blip r:embed="rId4"/>
+                    <a:stretch>
+                      <a:fillRect/>
+                    </a:stretch>
+                  </pic:blipFill>
+                  <pic:spPr>
+                    <a:xfrm>
+                      <a:off x="0" y="0"/>
+                      <a:ext cx="3886742" cy="857370"/>
+                    </a:xfrm>
+                    <a:prstGeom prst="rect">
+                      <a:avLst/>
+                    </a:prstGeom>
+                  </pic:spPr>
+                </pic:pic>
+              </a:graphicData>
+            </a:graphic>
+          </wp:inline>
+        </w:drawing>
+      </w:r>
+    </w:p>
+    <w:p>
+      <w:pPr>
+        <w:rPr>
+          <w:color w:val="0070C0"/>
+        </w:rPr>
+      </w:pPr>
+      <w:r>
+        <w:rPr>
+          <w:noProof/>
+          <w:color w:val="0070C0"/>
+        </w:rPr>
+        <w:drawing>
+          <wp:inline distT="0" distB="0" distL="0" distR="0" wp14:anchorId="329330AF" wp14:editId="53BF66B7">
+            <wp:extent cx="3305636" cy="209579"/>
+            <wp:effectExtent l="0" t="0" r="9525" b="0"/>
+            <wp:docPr id="2" name="Imagen 2"/>
+            <wp:cNvGraphicFramePr>
+              <a:graphicFrameLocks xmlns:a="http://schemas.openxmlformats.org/drawingml/2006/main" noChangeAspect="1"/>
+            </wp:cNvGraphicFramePr>
+            <a:graphic xmlns:a="http://schemas.openxmlformats.org/drawingml/2006/main">
+              <a:graphicData uri="http://schemas.openxmlformats.org/drawingml/2006/picture">
+                <pic:pic xmlns:pic="http://schemas.openxmlformats.org/drawingml/2006/picture">
+                  <pic:nvPicPr>
+                    <pic:cNvPr id="1" name=""/>
+                    <pic:cNvPicPr/>
+                  </pic:nvPicPr>
+                  <pic:blipFill>
+                    <a:blip r:embed="rId5"/>
+                    <a:stretch>
+                      <a:fillRect/>
+                    </a:stretch>
+                  </pic:blipFill>
+                  <pic:spPr>
+                    <a:xfrm>
+                      <a:off x="0" y="0"/>
+                      <a:ext cx="3305636" cy="209579"/>
+                    </a:xfrm>
+                    <a:prstGeom prst="rect">
+                      <a:avLst/>
+                    </a:prstGeom>
+                  </pic:spPr>
+                </pic:pic>
+              </a:graphicData>
+            </a:graphic>
+          </wp:inline>
+        </w:drawing>
+      </w:r>
+    </w:p>
+    <w:p>
+      <w:pPr>
+        <w:rPr>
+          <w:color w:val="FF0000"/>
+        </w:rPr>
+      </w:pPr>
+      <w:r>
+        <w:rPr>
+          <w:color w:val="FF0000"/>
+        </w:rPr>
+        <w:t>Vistual Studio</w:t>
+      </w:r>
+    </w:p>
+    <w:p/>
+    <w:p>
+      <w:r>
+        <w:rPr>
+          <w:noProof/>
+        </w:rPr>
+        <w:drawing>
+          <wp:inline distT="0" distB="0" distL="0" distR="0" wp14:anchorId="3BB9E5CA" wp14:editId="6918E9BA">
+            <wp:extent cx="5400040" cy="1485900"/>
+            <wp:effectExtent l="0" t="0" r="0" b="0"/>
+            <wp:docPr id="3" name="Imagen 3"/>
+            <wp:cNvGraphicFramePr>
+              <a:graphicFrameLocks xmlns:a="http://schemas.openxmlformats.org/drawingml/2006/main" noChangeAspect="1"/>
+            </wp:cNvGraphicFramePr>
+            <a:graphic xmlns:a="http://schemas.openxmlformats.org/drawingml/2006/main">
+              <a:graphicData uri="http://schemas.openxmlformats.org/drawingml/2006/picture">
+                <pic:pic xmlns:pic="http://schemas.openxmlformats.org/drawingml/2006/picture">
+                  <pic:nvPicPr>
+                    <pic:cNvPr id="1" name=""/>
+                    <pic:cNvPicPr/>
+                  </pic:nvPicPr>
+                  <pic:blipFill>
+                    <a:blip r:embed="rId6"/>
+                    <a:stretch>
+                      <a:fillRect/>
+                    </a:stretch>
+                  </pic:blipFill>
+                  <pic:spPr>
+                    <a:xfrm>
+                      <a:off x="0" y="0"/>
+                      <a:ext cx="5400040" cy="1485900"/>
+                    </a:xfrm>
+                    <a:prstGeom prst="rect">
+                      <a:avLst/>
+                    </a:prstGeom>
+                  </pic:spPr>
+                </pic:pic>
+              </a:graphicData>
+            </a:graphic>
+          </wp:inline>
+        </w:drawing>
+      </w:r>
+    </w:p>
+    <w:p>
+      <w:r>
+        <w:t xml:space="preserve">Elegir Net </w:t>
+      </w:r>
+    </w:p>
+    <w:p>
+      <w:r>
+        <w:rPr>
+          <w:noProof/>
+        </w:rPr>
+        <w:drawing>
+          <wp:inline distT="0" distB="0" distL="0" distR="0" wp14:anchorId="5971BCD7" wp14:editId="17791D26">
+            <wp:extent cx="2686719" cy="1488690"/>
+            <wp:effectExtent l="0" t="0" r="0" b="0"/>
+            <wp:docPr id="5" name="Imagen 5"/>
+            <wp:cNvGraphicFramePr>
+              <a:graphicFrameLocks xmlns:a="http://schemas.openxmlformats.org/drawingml/2006/main" noChangeAspect="1"/>
+            </wp:cNvGraphicFramePr>
+            <a:graphic xmlns:a="http://schemas.openxmlformats.org/drawingml/2006/main">
+              <a:graphicData uri="http://schemas.openxmlformats.org/drawingml/2006/picture">
+                <pic:pic xmlns:pic="http://schemas.openxmlformats.org/drawingml/2006/picture">
+                  <pic:nvPicPr>
+                    <pic:cNvPr id="1" name=""/>
+                    <pic:cNvPicPr/>
+                  </pic:nvPicPr>
+                  <pic:blipFill>
+                    <a:blip r:embed="rId7"/>
+                    <a:stretch>
+                      <a:fillRect/>
+                    </a:stretch>
+                  </pic:blipFill>
+                  <pic:spPr>
+                    <a:xfrm>
+                      <a:off x="0" y="0"/>
+                      <a:ext cx="2699277" cy="1495648"/>
+                    </a:xfrm>
+                    <a:prstGeom prst="rect">
+                      <a:avLst/>
+                    </a:prstGeom>
+                  </pic:spPr>
+                </pic:pic>
+              </a:graphicData>
+            </a:graphic>
+          </wp:inline>
+        </w:drawing>
+      </w:r>
     </w:p>
     <w:p/>
     <w:p/>
     <w:p/>
+    <w:p/>
+    <w:p/>
+    <w:p/>
+    <w:p/>
+    <w:p/>
+    <w:p/>
+    <w:p/>
+    <w:p/>
+    <w:p>
+      <w:r>
+        <w:lastRenderedPageBreak/>
+        <w:drawing>
+          <wp:inline distT="0" distB="0" distL="0" distR="0" wp14:anchorId="6B7B4AF3" wp14:editId="00276324">
+            <wp:extent cx="5400040" cy="2889885"/>
+            <wp:effectExtent l="0" t="0" r="0" b="5715"/>
+            <wp:docPr id="6" name="Imagen 6"/>
+            <wp:cNvGraphicFramePr>
+              <a:graphicFrameLocks xmlns:a="http://schemas.openxmlformats.org/drawingml/2006/main" noChangeAspect="1"/>
+            </wp:cNvGraphicFramePr>
+            <a:graphic xmlns:a="http://schemas.openxmlformats.org/drawingml/2006/main">
+              <a:graphicData uri="http://schemas.openxmlformats.org/drawingml/2006/picture">
+                <pic:pic xmlns:pic="http://schemas.openxmlformats.org/drawingml/2006/picture">
+                  <pic:nvPicPr>
+                    <pic:cNvPr id="1" name=""/>
+                    <pic:cNvPicPr/>
+                  </pic:nvPicPr>
+                  <pic:blipFill>
+                    <a:blip r:embed="rId8"/>
+                    <a:stretch>
+                      <a:fillRect/>
+                    </a:stretch>
+                  </pic:blipFill>
+                  <pic:spPr>
+                    <a:xfrm>
+                      <a:off x="0" y="0"/>
+                      <a:ext cx="5400040" cy="2889885"/>
+                    </a:xfrm>
+                    <a:prstGeom prst="rect">
+                      <a:avLst/>
+                    </a:prstGeom>
+                  </pic:spPr>
+                </pic:pic>
+              </a:graphicData>
+            </a:graphic>
+          </wp:inline>
+        </w:drawing>
+      </w:r>
+    </w:p>
+    <w:p>
+      <w:r>
+        <w:drawing>
+          <wp:inline distT="0" distB="0" distL="0" distR="0" wp14:anchorId="0A44DA9D" wp14:editId="35DA50A6">
+            <wp:extent cx="5400040" cy="3856990"/>
+            <wp:effectExtent l="0" t="0" r="0" b="0"/>
+            <wp:docPr id="7" name="Imagen 7"/>
+            <wp:cNvGraphicFramePr>
+              <a:graphicFrameLocks xmlns:a="http://schemas.openxmlformats.org/drawingml/2006/main" noChangeAspect="1"/>
+            </wp:cNvGraphicFramePr>
+            <a:graphic xmlns:a="http://schemas.openxmlformats.org/drawingml/2006/main">
+              <a:graphicData uri="http://schemas.openxmlformats.org/drawingml/2006/picture">
+                <pic:pic xmlns:pic="http://schemas.openxmlformats.org/drawingml/2006/picture">
+                  <pic:nvPicPr>
+                    <pic:cNvPr id="1" name=""/>
+                    <pic:cNvPicPr/>
+                  </pic:nvPicPr>
+                  <pic:blipFill>
+                    <a:blip r:embed="rId9"/>
+                    <a:stretch>
+                      <a:fillRect/>
+                    </a:stretch>
+                  </pic:blipFill>
+                  <pic:spPr>
+                    <a:xfrm>
+                      <a:off x="0" y="0"/>
+                      <a:ext cx="5400040" cy="3856990"/>
+                    </a:xfrm>
+                    <a:prstGeom prst="rect">
+                      <a:avLst/>
+                    </a:prstGeom>
+                  </pic:spPr>
+                </pic:pic>
+              </a:graphicData>
+            </a:graphic>
+          </wp:inline>
+        </w:drawing>
+      </w:r>
+    </w:p>
+    <w:p>
+      <w:r>
+        <w:lastRenderedPageBreak/>
+        <w:drawing>
+          <wp:inline distT="0" distB="0" distL="0" distR="0" wp14:anchorId="309354A4" wp14:editId="1047986D">
+            <wp:extent cx="5400040" cy="2903220"/>
+            <wp:effectExtent l="0" t="0" r="0" b="0"/>
+            <wp:docPr id="8" name="Imagen 8"/>
+            <wp:cNvGraphicFramePr>
+              <a:graphicFrameLocks xmlns:a="http://schemas.openxmlformats.org/drawingml/2006/main" noChangeAspect="1"/>
+            </wp:cNvGraphicFramePr>
+            <a:graphic xmlns:a="http://schemas.openxmlformats.org/drawingml/2006/main">
+              <a:graphicData uri="http://schemas.openxmlformats.org/drawingml/2006/picture">
+                <pic:pic xmlns:pic="http://schemas.openxmlformats.org/drawingml/2006/picture">
+                  <pic:nvPicPr>
+                    <pic:cNvPr id="1" name=""/>
+                    <pic:cNvPicPr/>
+                  </pic:nvPicPr>
+                  <pic:blipFill>
+                    <a:blip r:embed="rId10"/>
+                    <a:stretch>
+                      <a:fillRect/>
+                    </a:stretch>
+                  </pic:blipFill>
+                  <pic:spPr>
+                    <a:xfrm>
+                      <a:off x="0" y="0"/>
+                      <a:ext cx="5400040" cy="2903220"/>
+                    </a:xfrm>
+                    <a:prstGeom prst="rect">
+                      <a:avLst/>
+                    </a:prstGeom>
+                  </pic:spPr>
+                </pic:pic>
+              </a:graphicData>
+            </a:graphic>
+          </wp:inline>
+        </w:drawing>
+      </w:r>
+    </w:p>
     <w:sectPr>
       <w:pgSz w:w="11906" w:h="16838"/>
       <w:pgMar w:top="1417" w:right="1701" w:bottom="1417" w:left="1701" w:header="708" w:footer="708" w:gutter="0"/>

</xml_diff>